<commit_message>
docs: clarify login requirement for booking and update database foreign key rationale
</commit_message>
<xml_diff>
--- a/BaoCaoLTDiDong.docx
+++ b/BaoCaoLTDiDong.docx
@@ -5345,7 +5345,7 @@
         <w:rPr>
           <w:lang w:val="vi-VN"/>
         </w:rPr>
-        <w:t>Đồ án xây dựng ứng dụng di động đặt phòng cho "Khách Sạn Grand Luxury", một khách sạn giả định tại Đà Nẵng, cách bãi biển Mỹ Khê khoảng 50 mét. Khách có thể xem hạng phòng, tìm phòng trống theo ngày và số người, đặt phòng ngay trên điện thoại, kể cả khi chưa có tài khoản.</w:t>
+        <w:t>Đồ án xây dựng ứng dụng di động đặt phòng cho "Khách Sạn Grand Luxury", một khách sạn giả định tại Đà Nẵng, cách bãi biển Mỹ Khê khoảng 50 mét. Khách có thể xem hạng phòng, tìm phòng trống theo ngày và số người, đăng nhập tài khoản thành viên để đặt phòng an toàn, quản lý đơn và nhận thông báo đẩy ngay trên điện thoại.</w:t>
       </w:r>
     </w:p>
     <w:p>
@@ -5800,7 +5800,7 @@
                 <w:sz w:val="26"/>
                 <w:lang w:val="vi-VN"/>
               </w:rPr>
-              <w:t>Đặt phòng với tư cách khách vãng lai (không cần đăng nhập) hoặc thành viên</w:t>
+              <w:t>Đặt phòng lưu trú cho thành viên (yêu cầu đăng nhập tài khoản để bảo mật và quản lý đơn)</w:t>
             </w:r>
           </w:p>
         </w:tc>
@@ -7396,16 +7396,14 @@
                 <w:sz w:val="26"/>
                 <w:lang w:val="vi-VN"/>
               </w:rPr>
-              <w:t xml:space="preserve">id, id_tai_khoan (có thể NULL với khách vãng lai), ten_khach_hang, sdt_khach_hang, ngay_nhan_phong, ngay_tra_phong, id_loai_phong, ten_loai_phong_khi_dat, so_luong_phong, gia_phong_khi_dat, tong_tien, so_tien_da_thanh_toan, </w:t>
-            </w:r>
-            <w:r>
-              <w:rPr>
-                <w:rFonts w:ascii="Times New Roman" w:hAnsi="Times New Roman"/>
-                <w:sz w:val="26"/>
-                <w:lang w:val="vi-VN"/>
-              </w:rPr>
-              <w:lastRenderedPageBreak/>
-              <w:t>trang_thai, trang_thai_thanh_toan</w:t>
+              <w:t>id, id_tai_khoan (liên kết tài khoản thành viên, ON DELETE SET NULL), ten_khach_hang, sdt_khach_hang, ngay_nhan_phong, ngay_tra_phong, id_loai_phong, ten_loai_phong_khi_dat, so_luong_phong, gia_phong_khi_dat, tong_tien, so_tien_da_thanh_toan, trang_thai, trang_thai_thanh_toan</w:t>
+            </w:r>
+            <w:r>
+              <w:rPr>
+                <w:rFonts w:ascii="Times New Roman" w:hAnsi="Times New Roman"/>
+                <w:sz w:val="26"/>
+                <w:lang w:val="vi-VN"/>
+              </w:rPr>
             </w:r>
           </w:p>
         </w:tc>
@@ -9242,13 +9240,12 @@
           <w:szCs w:val="20"/>
           <w:lang w:val="vi-VN"/>
         </w:rPr>
-        <w:t>id_tai_khoan</w:t>
-      </w:r>
-      <w:r>
-        <w:rPr>
-          <w:lang w:val="vi-VN"/>
-        </w:rPr>
-        <w:t xml:space="preserve"> cho phép NULL để hỗ trợ khách vãng lai đặt phòng không cần tài khoản.</w:t>
+        <w:t>id_tai_khoan cho phép NULL theo quy tắc toàn vẹn dữ liệu (ON DELETE SET NULL); nếu tài khoản bị xóa thì lịch sử đơn vẫn được bảo lưu, trong khi ứng dụng di động yêu cầu người dùng đăng nhập tài khoản trước khi đặt phòng để bảo mật và quản lý đơn.</w:t>
+      </w:r>
+      <w:r>
+        <w:rPr>
+          <w:lang w:val="vi-VN"/>
+        </w:rPr>
       </w:r>
     </w:p>
     <w:p>
@@ -10914,7 +10911,7 @@
                 <w:sz w:val="26"/>
                 <w:lang w:val="vi-VN"/>
               </w:rPr>
-              <w:t>Đặt phòng cho khách vãng lai</w:t>
+              <w:t>API dự phòng đặt phòng trực tiếp</w:t>
             </w:r>
           </w:p>
         </w:tc>
@@ -12788,7 +12785,6 @@
                 <w:sz w:val="26"/>
                 <w:lang w:val="vi-VN"/>
               </w:rPr>
-              <w:t xml:space="preserve"> hoặc </w:t>
             </w:r>
             <w:r>
               <w:rPr>
@@ -12797,7 +12793,6 @@
                 <w:szCs w:val="20"/>
                 <w:lang w:val="vi-VN"/>
               </w:rPr>
-              <w:t>/api/dat-phong/khach-vang-lai</w:t>
             </w:r>
           </w:p>
         </w:tc>
@@ -13221,7 +13216,7 @@
         <w:rPr>
           <w:lang w:val="vi-VN"/>
         </w:rPr>
-        <w:t>Khách chưa đăng nhập vẫn tìm và đặt phòng được qua đường dẫn khách vãng lai; sau khi đăng nhập, đơn đặt gắn với tài khoản và xem lại được trong lịch sử.</w:t>
+        <w:t>Khách có thể tự do khám phá và tra cứu phòng trống; khi tiến hành Đặt phòng, ứng dụng yêu cầu đăng nhập tài khoản thành viên để liên kết đơn với tài khoản cá nhân, theo dõi lịch sử và nhận thông báo đẩy.</w:t>
       </w:r>
     </w:p>
     <w:p>
@@ -14387,7 +14382,7 @@
                 <w:sz w:val="26"/>
                 <w:lang w:val="vi-VN"/>
               </w:rPr>
-              <w:t>Đặt phòng không đăng nhập (khách vãng lai)</w:t>
+              <w:t>Khách chưa đăng nhập bấm nút Đặt phòng</w:t>
             </w:r>
           </w:p>
         </w:tc>
@@ -14410,7 +14405,7 @@
                 <w:sz w:val="26"/>
                 <w:lang w:val="vi-VN"/>
               </w:rPr>
-              <w:t>Đơn được tạo, hiện thông báo thành công</w:t>
+              <w:t>Ứng dụng hiển thị Dialog yêu cầu đăng nhập để bảo mật đơn và quản lý lịch sử</w:t>
             </w:r>
           </w:p>
         </w:tc>
@@ -14481,7 +14476,7 @@
                 <w:sz w:val="26"/>
                 <w:lang w:val="vi-VN"/>
               </w:rPr>
-              <w:t>Nhận token, vào được màn hình tài khoản</w:t>
+              <w:t>Nhận token JWT, chuyển sang trạng thái đã đăng nhập và lưu phiên an toàn</w:t>
             </w:r>
           </w:p>
         </w:tc>
@@ -14529,7 +14524,7 @@
                 <w:sz w:val="26"/>
                 <w:lang w:val="vi-VN"/>
               </w:rPr>
-              <w:t>Đặt phòng với tư cách thành viên</w:t>
+              <w:t>Tiến hành Đặt phòng với tài khoản thành viên</w:t>
             </w:r>
           </w:p>
         </w:tc>
@@ -14552,7 +14547,7 @@
                 <w:sz w:val="26"/>
                 <w:lang w:val="vi-VN"/>
               </w:rPr>
-              <w:t>Đơn gắn với tài khoản</w:t>
+              <w:t>Đơn được tạo thành công, gắn với tài khoản cá nhân và nhận thông báo đẩy tức thời</w:t>
             </w:r>
           </w:p>
         </w:tc>
@@ -15537,7 +15532,7 @@
         <w:rPr>
           <w:lang w:val="vi-VN"/>
         </w:rPr>
-        <w:t>Ứng dụng di động cho phép xem hạng phòng, tìm phòng trống theo ngày và số người, đặt phòng cả khi chưa đăng nhập, xem lịch sử đặt phòng.</w:t>
+        <w:t>Ứng dụng di động cho phép xem hạng phòng, tìm phòng trống theo ngày và số người, đăng nhập tài khoản thành viên để đặt phòng, quản lý lịch sử đơn và nhận thông báo tức thời.</w:t>
       </w:r>
     </w:p>
     <w:p>

</xml_diff>